<commit_message>
Update project plan to Aug 2026 - Mar 2027 timeline, add invitation texts and gitignore
Co-Authored-By: Claude Opus 4.7 <noreply@anthropic.com>
</commit_message>
<xml_diff>
--- a/docs/project_plan.docx
+++ b/docs/project_plan.docx
@@ -21,7 +21,7 @@
           <w:i/>
           <w:sz w:val="22"/>
         </w:rPr>
-        <w:t>Плановый старт проекта: 22 июня 2026 года. Цель: провести ~50 внутренних интервью, извлечь Атомы и подготовить документ с улучшениями и презентацию для руководства.</w:t>
+        <w:t>Плановый старт интервью: 31 августа 2026 года. Цель: провести ~45 внутренних интервью, извлечь Атомы и подготовить документ с улучшениями и презентацию для руководства.</w:t>
       </w:r>
     </w:p>
     <w:p>
@@ -62,7 +62,7 @@
         <w:rPr>
           <w:rFonts w:ascii="Arial" w:hAnsi="Arial" w:eastAsia="Arial"/>
         </w:rPr>
-        <w:t>46 контактов из project_contacts.csv</w:t>
+        <w:t>45 контактов из project_contacts.csv</w:t>
       </w:r>
     </w:p>
     <w:p>
@@ -77,7 +77,7 @@
         <w:rPr>
           <w:rFonts w:ascii="Arial" w:hAnsi="Arial" w:eastAsia="Arial"/>
         </w:rPr>
-        <w:t>46 (100% от плана)</w:t>
+        <w:t>45 (100% от плана)</w:t>
       </w:r>
     </w:p>
     <w:p>
@@ -216,7 +216,18 @@
         <w:rPr>
           <w:rFonts w:ascii="Arial" w:hAnsi="Arial" w:eastAsia="Arial"/>
         </w:rPr>
-        <w:t>Сформировать читаемый список контактов — Марина + Claude — 15–16 июня — завершено — project_contacts.csv (47 контактов)</w:t>
+        <w:t>Сформировать читаемый список контактов — Марина + Claude — 15–16 июня — завершено — project_contacts.csv (45 контактов)</w:t>
+      </w:r>
+    </w:p>
+    <w:p>
+      <w:pPr>
+        <w:pStyle w:val="ListBullet"/>
+      </w:pPr>
+      <w:r>
+        <w:rPr>
+          <w:rFonts w:ascii="Arial" w:hAnsi="Arial" w:eastAsia="Arial"/>
+        </w:rPr>
+        <w:t>Обновить контакты из нового xlsx (05.08.2026) — Марина + Claude — 27 августа — завершено — project_contacts.csv (45 контактов)</w:t>
       </w:r>
     </w:p>
     <w:p>
@@ -283,7 +294,7 @@
           <w:color w:val="4CAF50"/>
           <w:sz w:val="26"/>
         </w:rPr>
-        <w:t>Этап 2. Запуск (22–27 июня 2026)</w:t>
+        <w:t>Этап 2. Запуск (31 августа – 4 сентября 2026)</w:t>
       </w:r>
     </w:p>
     <w:p>
@@ -294,7 +305,7 @@
         <w:rPr>
           <w:rFonts w:ascii="Arial" w:hAnsi="Arial" w:eastAsia="Arial"/>
         </w:rPr>
-        <w:t>Марина проводит первое реальное интервью — Марина — 22–27 июня — не начато — аудио + заметки Марины</w:t>
+        <w:t>Марина проводит первое реальное интервью — Марина — 31 августа – 4 сентября — не начато — аудио + заметки Марины</w:t>
       </w:r>
     </w:p>
     <w:p>
@@ -305,7 +316,7 @@
         <w:rPr>
           <w:rFonts w:ascii="Arial" w:hAnsi="Arial" w:eastAsia="Arial"/>
         </w:rPr>
-        <w:t>Расшифровать первое интервью Марины — Марина + Claude — 22–27 июня — не начато — транскрипт .txt</w:t>
+        <w:t>Расшифровать первое интервью Марины — Марина + Claude — 31 августа – 4 сентября — не начато — транскрипт .txt</w:t>
       </w:r>
     </w:p>
     <w:p>
@@ -316,7 +327,7 @@
         <w:rPr>
           <w:rFonts w:ascii="Arial" w:hAnsi="Arial" w:eastAsia="Arial"/>
         </w:rPr>
-        <w:t>Извлечь Атомы из первого интервью Марины — Марина + Claude — 22–27 июня — не начато — atoms.csv пополнен</w:t>
+        <w:t>Извлечь Атомы из первого интервью Марины — Марина + Claude — 31 августа – 4 сентября — не начато — atoms.csv пополнен</w:t>
       </w:r>
     </w:p>
     <w:p>
@@ -328,7 +339,7 @@
           <w:color w:val="FF9800"/>
           <w:sz w:val="26"/>
         </w:rPr>
-        <w:t>Этап 3. Набор интервью (29 июня – 30 октября 2026)</w:t>
+        <w:t>Этап 3. Набор интервью (7 сентября 2026 – 29 января 2027)</w:t>
       </w:r>
     </w:p>
     <w:p>
@@ -339,7 +350,7 @@
         <w:rPr>
           <w:rFonts w:ascii="Arial" w:hAnsi="Arial" w:eastAsia="Arial"/>
         </w:rPr>
-        <w:t>Марина проводит 2–3 интервью в неделю — Марина — 29 июня – 30 октября — не начато — 46 интервью</w:t>
+        <w:t>Марина проводит 2–3 интервью в неделю — Марина — 7 сентября – 29 января — не начато — 45 интервью</w:t>
       </w:r>
     </w:p>
     <w:p>
@@ -350,7 +361,7 @@
         <w:rPr>
           <w:rFonts w:ascii="Arial" w:hAnsi="Arial" w:eastAsia="Arial"/>
         </w:rPr>
-        <w:t>Расшифровка и первичная обработка записей — Марина + Claude — 29 июня – 30 октября — не начато — транскрипты и заметки</w:t>
+        <w:t>Расшифровка и первичная обработка записей — Марина + Claude — 7 сентября – 29 января — не начато — транскрипты и заметки</w:t>
       </w:r>
     </w:p>
     <w:p>
@@ -361,7 +372,7 @@
         <w:rPr>
           <w:rFonts w:ascii="Arial" w:hAnsi="Arial" w:eastAsia="Arial"/>
         </w:rPr>
-        <w:t>Извлечение Атомов из всех интервью — Марина + Claude — 6 июля – 6 ноября — не начато — полный реестр Атомов</w:t>
+        <w:t>Извлечение Атомов из всех интервью — Марина + Claude — 14 сентября – 5 февраля — не начато — полный реестр Атомов</w:t>
       </w:r>
     </w:p>
     <w:p>
@@ -372,7 +383,7 @@
         <w:rPr>
           <w:rFonts w:ascii="Arial" w:hAnsi="Arial" w:eastAsia="Arial"/>
         </w:rPr>
-        <w:t>Провести интервью со всеми 46 контактами — Марина — 22 июня – 30 октября — не начато — 46 аудиозаписей (ориентировочно 19 недель)</w:t>
+        <w:t>Провести интервью со всеми 45 контактами — Марина — 31 августа – 29 января — не начато — 45 аудиозаписей (ориентировочно 20 недель)</w:t>
       </w:r>
     </w:p>
     <w:p>
@@ -384,7 +395,7 @@
           <w:color w:val="9C27B0"/>
           <w:sz w:val="26"/>
         </w:rPr>
-        <w:t>Этап 4. Анализ (2–20 ноября 2026)</w:t>
+        <w:t>Этап 4. Анализ (1–26 февраля 2027)</w:t>
       </w:r>
     </w:p>
     <w:p>
@@ -395,7 +406,7 @@
         <w:rPr>
           <w:rFonts w:ascii="Arial" w:hAnsi="Arial" w:eastAsia="Arial"/>
         </w:rPr>
-        <w:t>Сгруппировать Атомы по роли / команде / JTBD — Марина + Claude — 2–13 ноября — не начато — группировка и приоритизация</w:t>
+        <w:t>Сгруппировать Атомы по роли / команде / JTBD — Марина + Claude — 1–19 февраля — не начато — группировка и приоритизация</w:t>
       </w:r>
     </w:p>
     <w:p>
@@ -406,7 +417,7 @@
         <w:rPr>
           <w:rFonts w:ascii="Arial" w:hAnsi="Arial" w:eastAsia="Arial"/>
         </w:rPr>
-        <w:t>Выделить ключевые проблемы и гипотезы улучшений — Марина + Claude — 2–20 ноября — не начато — список улучшений с владельцами</w:t>
+        <w:t>Выделить ключевые проблемы и гипотезы улучшений — Марина + Claude — 8–26 февраля — не начато — список улучшений с владельцами</w:t>
       </w:r>
     </w:p>
     <w:p>
@@ -418,7 +429,7 @@
           <w:color w:val="E91E63"/>
           <w:sz w:val="26"/>
         </w:rPr>
-        <w:t>Этап 5. Документация и презентация (16 ноября – 4 декабря 2026)</w:t>
+        <w:t>Этап 5. Документация и презентация (1–22 марта 2027)</w:t>
       </w:r>
     </w:p>
     <w:p>
@@ -429,7 +440,7 @@
         <w:rPr>
           <w:rFonts w:ascii="Arial" w:hAnsi="Arial" w:eastAsia="Arial"/>
         </w:rPr>
-        <w:t>Подготовить документ с улучшениями — Марина + Claude — 16–27 ноября — не начато — improvements_document.docx/pdf</w:t>
+        <w:t>Подготовить документ с улучшениями — Марина + Claude — 1–12 марта — не начато — improvements_document.docx/pdf</w:t>
       </w:r>
     </w:p>
     <w:p>
@@ -440,7 +451,7 @@
         <w:rPr>
           <w:rFonts w:ascii="Arial" w:hAnsi="Arial" w:eastAsia="Arial"/>
         </w:rPr>
-        <w:t>Подготовить презентацию для руководства — Марина + Claude — 23 ноября – 4 декабря — не начато — presentation.pptx/pdf</w:t>
+        <w:t>Подготовить презентацию для руководства — Марина + Claude — 8–19 марта — не начато — presentation.pptx/pdf</w:t>
       </w:r>
     </w:p>
     <w:p>
@@ -451,7 +462,7 @@
         <w:rPr>
           <w:rFonts w:ascii="Arial" w:hAnsi="Arial" w:eastAsia="Arial"/>
         </w:rPr>
-        <w:t>Согласовать итоговые материалы с руководством — Марина — 30 ноября – 4 декабря — не начато — согласованная версия</w:t>
+        <w:t>Согласовать итоговые материалы с руководством — Марина — 15–19 марта — не начато — согласованная версия</w:t>
       </w:r>
     </w:p>
     <w:p>
@@ -462,7 +473,7 @@
         <w:rPr>
           <w:rFonts w:ascii="Arial" w:hAnsi="Arial" w:eastAsia="Arial"/>
         </w:rPr>
-        <w:t>Презентовать результаты руководству — Марина — 7 декабря (ориентировочно) — не начато — проведённая презентация</w:t>
+        <w:t>Презентовать результаты руководству — Марина — 22 марта (ориентировочно) — не начато — проведённая презентация</w:t>
       </w:r>
     </w:p>
     <w:p>
@@ -583,7 +594,7 @@
           <w:i/>
           <w:sz w:val="20"/>
         </w:rPr>
-        <w:t>Подготовлено: 28.07.2026</w:t>
+        <w:t>Подготовлено: 27.08.2026</w:t>
       </w:r>
     </w:p>
     <w:sectPr>

</xml_diff>

<commit_message>
Update plan for 43 contacts and 5 interviews/week, add shy-respondent cheat sheet
Co-Authored-By: Claude Opus 4.7 <noreply@anthropic.com>
</commit_message>
<xml_diff>
--- a/docs/project_plan.docx
+++ b/docs/project_plan.docx
@@ -21,7 +21,7 @@
           <w:i/>
           <w:sz w:val="22"/>
         </w:rPr>
-        <w:t>Плановый старт интервью: 31 августа 2026 года. Цель: провести ~45 внутренних интервью, извлечь Атомы и подготовить документ с улучшениями и презентацию для руководства.</w:t>
+        <w:t>Плановый старт интервью: 31 августа 2026 года. Цель: провести ~43 внутренних интервью, извлечь Атомы и подготовить документ с улучшениями и презентацию для руководства.</w:t>
       </w:r>
     </w:p>
     <w:p>
@@ -62,7 +62,7 @@
         <w:rPr>
           <w:rFonts w:ascii="Arial" w:hAnsi="Arial" w:eastAsia="Arial"/>
         </w:rPr>
-        <w:t>45 контактов из project_contacts.csv</w:t>
+        <w:t>43 контакта из project_contacts.csv</w:t>
       </w:r>
     </w:p>
     <w:p>
@@ -77,7 +77,7 @@
         <w:rPr>
           <w:rFonts w:ascii="Arial" w:hAnsi="Arial" w:eastAsia="Arial"/>
         </w:rPr>
-        <w:t>45 (100% от плана)</w:t>
+        <w:t>43 (100% от плана)</w:t>
       </w:r>
     </w:p>
     <w:p>
@@ -92,7 +92,7 @@
         <w:rPr>
           <w:rFonts w:ascii="Arial" w:hAnsi="Arial" w:eastAsia="Arial"/>
         </w:rPr>
-        <w:t>2–3 в неделю, при возможности больше</w:t>
+        <w:t>5 в неделю, при возможности больше</w:t>
       </w:r>
     </w:p>
     <w:p>
@@ -137,7 +137,7 @@
         <w:rPr>
           <w:rFonts w:ascii="Arial" w:hAnsi="Arial" w:eastAsia="Arial"/>
         </w:rPr>
-        <w:t>Zoom / телефон / диктофон</w:t>
+        <w:t>meeting-kit: пульт записи, 2 дорожки L/S</w:t>
       </w:r>
     </w:p>
     <w:p>
@@ -152,7 +152,7 @@
         <w:rPr>
           <w:rFonts w:ascii="Arial" w:hAnsi="Arial" w:eastAsia="Arial"/>
         </w:rPr>
-        <w:t>Локальный Whisper (transcribe_one.bat / transcribe.bat)</w:t>
+        <w:t>faster-whisper + диаризация ECAPA (meeting-kit, офлайн)</w:t>
       </w:r>
     </w:p>
     <w:p>
@@ -339,7 +339,7 @@
           <w:color w:val="FF9800"/>
           <w:sz w:val="26"/>
         </w:rPr>
-        <w:t>Этап 3. Набор интервью (7 сентября 2026 – 29 января 2027)</w:t>
+        <w:t>Этап 3. Набор интервью (7 сентября – 30 октября 2026)</w:t>
       </w:r>
     </w:p>
     <w:p>
@@ -350,7 +350,7 @@
         <w:rPr>
           <w:rFonts w:ascii="Arial" w:hAnsi="Arial" w:eastAsia="Arial"/>
         </w:rPr>
-        <w:t>Марина проводит 2–3 интервью в неделю — Марина — 7 сентября – 29 января — не начато — 45 интервью</w:t>
+        <w:t>Марина проводит 5 интервью в неделю — Марина — 7 сентября – 30 октября — не начато — 43 интервью</w:t>
       </w:r>
     </w:p>
     <w:p>
@@ -361,7 +361,7 @@
         <w:rPr>
           <w:rFonts w:ascii="Arial" w:hAnsi="Arial" w:eastAsia="Arial"/>
         </w:rPr>
-        <w:t>Расшифровка и первичная обработка записей — Марина + Claude — 7 сентября – 29 января — не начато — транскрипты и заметки</w:t>
+        <w:t>Расшифровка и первичная обработка записей — Марина + Claude — 7 сентября – 30 октября — не начато — транскрипты и заметки</w:t>
       </w:r>
     </w:p>
     <w:p>
@@ -372,7 +372,7 @@
         <w:rPr>
           <w:rFonts w:ascii="Arial" w:hAnsi="Arial" w:eastAsia="Arial"/>
         </w:rPr>
-        <w:t>Извлечение Атомов из всех интервью — Марина + Claude — 14 сентября – 5 февраля — не начато — полный реестр Атомов</w:t>
+        <w:t>Извлечение Атомов из всех интервью — Марина + Claude — 14 сентября – 6 ноября — не начато — полный реестр Атомов</w:t>
       </w:r>
     </w:p>
     <w:p>
@@ -383,7 +383,7 @@
         <w:rPr>
           <w:rFonts w:ascii="Arial" w:hAnsi="Arial" w:eastAsia="Arial"/>
         </w:rPr>
-        <w:t>Провести интервью со всеми 45 контактами — Марина — 31 августа – 29 января — не начато — 45 аудиозаписей (ориентировочно 20 недель)</w:t>
+        <w:t>Провести интервью со всеми 43 контактами — Марина — 31 августа – 29 января — не начато — 43 аудиозаписи (9 недель, ноябрь–февраль — буфер)</w:t>
       </w:r>
     </w:p>
     <w:p>
@@ -395,7 +395,7 @@
           <w:color w:val="9C27B0"/>
           <w:sz w:val="26"/>
         </w:rPr>
-        <w:t>Этап 4. Анализ (1–26 февраля 2027)</w:t>
+        <w:t>Этап 4. Анализ (9–27 ноября 2026)</w:t>
       </w:r>
     </w:p>
     <w:p>
@@ -406,7 +406,7 @@
         <w:rPr>
           <w:rFonts w:ascii="Arial" w:hAnsi="Arial" w:eastAsia="Arial"/>
         </w:rPr>
-        <w:t>Сгруппировать Атомы по роли / команде / JTBD — Марина + Claude — 1–19 февраля — не начато — группировка и приоритизация</w:t>
+        <w:t>Сгруппировать Атомы по роли / команде / JTBD — Марина + Claude — 9–19 ноября — не начато — группировка и приоритизация</w:t>
       </w:r>
     </w:p>
     <w:p>
@@ -417,7 +417,7 @@
         <w:rPr>
           <w:rFonts w:ascii="Arial" w:hAnsi="Arial" w:eastAsia="Arial"/>
         </w:rPr>
-        <w:t>Выделить ключевые проблемы и гипотезы улучшений — Марина + Claude — 8–26 февраля — не начато — список улучшений с владельцами</w:t>
+        <w:t>Выделить ключевые проблемы и гипотезы улучшений — Марина + Claude — 16–27 ноября — не начато — список улучшений с владельцами</w:t>
       </w:r>
     </w:p>
     <w:p>
@@ -429,7 +429,7 @@
           <w:color w:val="E91E63"/>
           <w:sz w:val="26"/>
         </w:rPr>
-        <w:t>Этап 5. Документация и презентация (1–22 марта 2027)</w:t>
+        <w:t>Этап 5. Документация и презентация (30 ноября 2026 – 15 января 2027)</w:t>
       </w:r>
     </w:p>
     <w:p>
@@ -440,7 +440,7 @@
         <w:rPr>
           <w:rFonts w:ascii="Arial" w:hAnsi="Arial" w:eastAsia="Arial"/>
         </w:rPr>
-        <w:t>Подготовить документ с улучшениями — Марина + Claude — 1–12 марта — не начато — improvements_document.docx/pdf</w:t>
+        <w:t>Подготовить документ с улучшениями — Марина + Claude — 30 ноября – 11 декабря — не начато — improvements_document.docx/pdf</w:t>
       </w:r>
     </w:p>
     <w:p>
@@ -451,7 +451,7 @@
         <w:rPr>
           <w:rFonts w:ascii="Arial" w:hAnsi="Arial" w:eastAsia="Arial"/>
         </w:rPr>
-        <w:t>Подготовить презентацию для руководства — Марина + Claude — 8–19 марта — не начато — presentation.pptx/pdf</w:t>
+        <w:t>Подготовить презентацию для руководства — Марина + Claude — 30 ноября – 11 декабря — не начато — presentation.pptx/pdf</w:t>
       </w:r>
     </w:p>
     <w:p>
@@ -462,7 +462,7 @@
         <w:rPr>
           <w:rFonts w:ascii="Arial" w:hAnsi="Arial" w:eastAsia="Arial"/>
         </w:rPr>
-        <w:t>Согласовать итоговые материалы с руководством — Марина — 15–19 марта — не начато — согласованная версия</w:t>
+        <w:t>Согласовать итоговые материалы с руководством — Марина — 14–18 декабря — не начато — согласованная версия</w:t>
       </w:r>
     </w:p>
     <w:p>
@@ -473,7 +473,7 @@
         <w:rPr>
           <w:rFonts w:ascii="Arial" w:hAnsi="Arial" w:eastAsia="Arial"/>
         </w:rPr>
-        <w:t>Презентовать результаты руководству — Марина — 22 марта (ориентировочно) — не начато — проведённая презентация</w:t>
+        <w:t>Презентовать результаты руководству — Марина — ~15 января (ориентировочно) — не начато — проведённая презентация</w:t>
       </w:r>
     </w:p>
     <w:p>
@@ -495,7 +495,7 @@
         <w:rPr>
           <w:rFonts w:ascii="Arial" w:hAnsi="Arial" w:eastAsia="Arial"/>
         </w:rPr>
-        <w:t>Если Марина не сможет проводить 2–3 интервью в неделю, сроки сдвинутся.</w:t>
+        <w:t>Если Марина не сможет проводить 5 интервью в неделю, планово упасть до 4 — буфер (ноябрь–февраль) позволяет не двигать презентацию.</w:t>
       </w:r>
     </w:p>
     <w:p>
@@ -594,7 +594,7 @@
           <w:i/>
           <w:sz w:val="20"/>
         </w:rPr>
-        <w:t>Подготовлено: 27.08.2026</w:t>
+        <w:t>Подготовлено: 31.08.2026</w:t>
       </w:r>
     </w:p>
     <w:sectPr>

</xml_diff>